<commit_message>
Maak rapport en planning gebruiksklaar
</commit_message>
<xml_diff>
--- a/Sjabloon keuringsformulier.docx
+++ b/Sjabloon keuringsformulier.docx
@@ -46,10 +46,6 @@
     <w:pPr>
       <w:pStyle w:val="Voettekst"/>
       <w:jc w:val="center"/>
-      <w:rPr>
-        <w:b/>
-        <w:bCs/>
-      </w:rPr>
     </w:pPr>
     <w:r>
       <w:rPr>
@@ -59,7 +55,7 @@
         <w:color w:val="0070C0"/>
       </w:rPr>
       <w:drawing>
-        <wp:anchor distT="0" distB="0" distL="114300" distR="114300" simplePos="0" relativeHeight="251659264" behindDoc="0" locked="0" layoutInCell="1" allowOverlap="1" wp14:anchorId="62B476E9" wp14:editId="0A4F29A5">
+        <wp:anchor distT="0" distB="0" distL="114300" distR="114300" simplePos="0" relativeHeight="251659264" behindDoc="0" locked="0" layoutInCell="1" allowOverlap="1" wp14:anchorId="62B476E9" wp14:editId="237F5BB2">
           <wp:simplePos x="0" y="0"/>
           <wp:positionH relativeFrom="column">
             <wp:posOffset>128905</wp:posOffset>
@@ -139,6 +135,44 @@
       </w:r>
     </w:hyperlink>
   </w:p>
+  <w:p>
+    <w:pPr>
+      <w:pStyle w:val="Voettekst"/>
+      <w:jc w:val="center"/>
+      <w:rPr>
+        <w:i/>
+        <w:iCs/>
+        <w:color w:val="00B0F0"/>
+        <w:sz w:val="18"/>
+        <w:szCs w:val="18"/>
+      </w:rPr>
+    </w:pPr>
+  </w:p>
+  <w:p>
+    <w:pPr>
+      <w:pStyle w:val="Voettekst"/>
+      <w:jc w:val="center"/>
+      <w:rPr>
+        <w:b/>
+        <w:bCs/>
+        <w:i/>
+        <w:iCs/>
+        <w:color w:val="00B0F0"/>
+        <w:sz w:val="18"/>
+        <w:szCs w:val="18"/>
+      </w:rPr>
+    </w:pPr>
+    <w:r>
+      <w:rPr>
+        <w:i/>
+        <w:iCs/>
+        <w:color w:val="00B0F0"/>
+        <w:sz w:val="18"/>
+        <w:szCs w:val="18"/>
+      </w:rPr>
+      <w:t>Gekeurd volgens BMWT Keur</w:t>
+    </w:r>
+  </w:p>
 </w:ftr>
 </file>
 
@@ -183,80 +217,7 @@
         <w:lang w:eastAsia="nl-NL"/>
       </w:rPr>
       <w:drawing>
-        <wp:anchor distT="0" distB="0" distL="114300" distR="114300" simplePos="0" relativeHeight="251661312" behindDoc="0" locked="0" layoutInCell="1" allowOverlap="1" wp14:anchorId="5692DB7F" wp14:editId="438B2C9E">
-          <wp:simplePos x="0" y="0"/>
-          <wp:positionH relativeFrom="page">
-            <wp:posOffset>6172776</wp:posOffset>
-          </wp:positionH>
-          <wp:positionV relativeFrom="paragraph">
-            <wp:posOffset>-46587</wp:posOffset>
-          </wp:positionV>
-          <wp:extent cx="1257965" cy="931574"/>
-          <wp:effectExtent l="133350" t="190500" r="94615" b="192405"/>
-          <wp:wrapNone/>
-          <wp:docPr id="1552433926" name="Afbeelding 7"/>
-          <wp:cNvGraphicFramePr>
-            <a:graphicFrameLocks xmlns:a="http://schemas.openxmlformats.org/drawingml/2006/main" noChangeAspect="1"/>
-          </wp:cNvGraphicFramePr>
-          <a:graphic xmlns:a="http://schemas.openxmlformats.org/drawingml/2006/main">
-            <a:graphicData uri="http://schemas.openxmlformats.org/drawingml/2006/picture">
-              <pic:pic xmlns:pic="http://schemas.openxmlformats.org/drawingml/2006/picture">
-                <pic:nvPicPr>
-                  <pic:cNvPr id="1552433926" name="Afbeelding 1552433926"/>
-                  <pic:cNvPicPr/>
-                </pic:nvPicPr>
-                <pic:blipFill rotWithShape="1">
-                  <a:blip r:embed="rId1">
-                    <a:extLst>
-                      <a:ext uri="{28A0092B-C50C-407E-A947-70E740481C1C}">
-                        <a14:useLocalDpi xmlns:a14="http://schemas.microsoft.com/office/drawing/2010/main" val="0"/>
-                      </a:ext>
-                    </a:extLst>
-                  </a:blip>
-                  <a:srcRect l="31313" t="28618" r="35949" b="28282"/>
-                  <a:stretch>
-                    <a:fillRect/>
-                  </a:stretch>
-                </pic:blipFill>
-                <pic:spPr bwMode="auto">
-                  <a:xfrm rot="1126646">
-                    <a:off x="0" y="0"/>
-                    <a:ext cx="1263891" cy="935962"/>
-                  </a:xfrm>
-                  <a:prstGeom prst="rect">
-                    <a:avLst/>
-                  </a:prstGeom>
-                  <a:ln>
-                    <a:noFill/>
-                  </a:ln>
-                  <a:extLst>
-                    <a:ext uri="{53640926-AAD7-44D8-BBD7-CCE9431645EC}">
-                      <a14:shadowObscured xmlns:a14="http://schemas.microsoft.com/office/drawing/2010/main"/>
-                    </a:ext>
-                  </a:extLst>
-                </pic:spPr>
-              </pic:pic>
-            </a:graphicData>
-          </a:graphic>
-          <wp14:sizeRelH relativeFrom="margin">
-            <wp14:pctWidth>0</wp14:pctWidth>
-          </wp14:sizeRelH>
-          <wp14:sizeRelV relativeFrom="margin">
-            <wp14:pctHeight>0</wp14:pctHeight>
-          </wp14:sizeRelV>
-        </wp:anchor>
-      </w:drawing>
-    </w:r>
-    <w:r>
-      <w:rPr>
-        <w:rFonts w:ascii="Calibri" w:eastAsia="Times New Roman" w:hAnsi="Calibri" w:cs="Times New Roman"/>
-        <w:noProof/>
-        <w:sz w:val="24"/>
-        <w:szCs w:val="24"/>
-        <w:lang w:eastAsia="nl-NL"/>
-      </w:rPr>
-      <w:drawing>
-        <wp:anchor distT="0" distB="0" distL="114300" distR="114300" simplePos="0" relativeHeight="251660288" behindDoc="1" locked="0" layoutInCell="1" allowOverlap="1" wp14:anchorId="3A4262DA" wp14:editId="65881595">
+        <wp:anchor distT="0" distB="0" distL="114300" distR="114300" simplePos="0" relativeHeight="251660288" behindDoc="1" locked="0" layoutInCell="1" allowOverlap="1" wp14:anchorId="3A4262DA" wp14:editId="20846373">
           <wp:simplePos x="0" y="0"/>
           <wp:positionH relativeFrom="margin">
             <wp:posOffset>1499235</wp:posOffset>
@@ -279,7 +240,7 @@
                   <pic:cNvPicPr/>
                 </pic:nvPicPr>
                 <pic:blipFill>
-                  <a:blip r:embed="rId2">
+                  <a:blip r:embed="rId1">
                     <a:extLst>
                       <a:ext uri="{28A0092B-C50C-407E-A947-70E740481C1C}">
                         <a14:useLocalDpi xmlns:a14="http://schemas.microsoft.com/office/drawing/2010/main" val="0"/>

</xml_diff>

<commit_message>
Update inspection report templates
</commit_message>
<xml_diff>
--- a/Sjabloon keuringsformulier.docx
+++ b/Sjabloon keuringsformulier.docx
@@ -45,7 +45,11 @@
   <w:p>
     <w:pPr>
       <w:pStyle w:val="Voettekst"/>
-      <w:jc w:val="center"/>
+      <w:rPr>
+        <w:b/>
+        <w:bCs/>
+        <w:color w:val="0070C0"/>
+      </w:rPr>
     </w:pPr>
     <w:r>
       <w:rPr>
@@ -55,13 +59,13 @@
         <w:color w:val="0070C0"/>
       </w:rPr>
       <w:drawing>
-        <wp:anchor distT="0" distB="0" distL="114300" distR="114300" simplePos="0" relativeHeight="251659264" behindDoc="0" locked="0" layoutInCell="1" allowOverlap="1" wp14:anchorId="62B476E9" wp14:editId="237F5BB2">
+        <wp:anchor distT="0" distB="0" distL="114300" distR="114300" simplePos="0" relativeHeight="251659264" behindDoc="0" locked="0" layoutInCell="1" allowOverlap="1" wp14:anchorId="62B476E9" wp14:editId="686E05A4">
           <wp:simplePos x="0" y="0"/>
           <wp:positionH relativeFrom="column">
-            <wp:posOffset>128905</wp:posOffset>
+            <wp:posOffset>-198964</wp:posOffset>
           </wp:positionH>
           <wp:positionV relativeFrom="paragraph">
-            <wp:posOffset>-622935</wp:posOffset>
+            <wp:posOffset>-444955</wp:posOffset>
           </wp:positionV>
           <wp:extent cx="1353185" cy="1353185"/>
           <wp:effectExtent l="0" t="0" r="0" b="0"/>
@@ -114,7 +118,21 @@
         <w:bCs/>
         <w:color w:val="0070C0"/>
       </w:rPr>
-      <w:t xml:space="preserve">                    </w:t>
+      <w:t xml:space="preserve">                 </w:t>
+    </w:r>
+  </w:p>
+  <w:p>
+    <w:pPr>
+      <w:pStyle w:val="Voettekst"/>
+      <w:jc w:val="center"/>
+    </w:pPr>
+    <w:r>
+      <w:rPr>
+        <w:b/>
+        <w:bCs/>
+        <w:color w:val="0070C0"/>
+      </w:rPr>
+      <w:t xml:space="preserve">   </w:t>
     </w:r>
     <w:r>
       <w:rPr>
@@ -147,11 +165,86 @@
         <w:szCs w:val="18"/>
       </w:rPr>
     </w:pPr>
+    <w:r>
+      <w:rPr>
+        <w:b/>
+        <w:bCs/>
+        <w:i/>
+        <w:iCs/>
+        <w:noProof/>
+        <w:color w:val="00B0F0"/>
+        <w:sz w:val="18"/>
+        <w:szCs w:val="18"/>
+      </w:rPr>
+      <w:drawing>
+        <wp:anchor distT="0" distB="0" distL="114300" distR="114300" simplePos="0" relativeHeight="251661312" behindDoc="0" locked="0" layoutInCell="1" allowOverlap="1" wp14:anchorId="1C1D3FAD" wp14:editId="1961A675">
+          <wp:simplePos x="0" y="0"/>
+          <wp:positionH relativeFrom="column">
+            <wp:posOffset>3316605</wp:posOffset>
+          </wp:positionH>
+          <wp:positionV relativeFrom="paragraph">
+            <wp:posOffset>51112</wp:posOffset>
+          </wp:positionV>
+          <wp:extent cx="1651895" cy="414068"/>
+          <wp:effectExtent l="0" t="0" r="0" b="0"/>
+          <wp:wrapNone/>
+          <wp:docPr id="1292918069" name="Afbeelding 3"/>
+          <wp:cNvGraphicFramePr>
+            <a:graphicFrameLocks xmlns:a="http://schemas.openxmlformats.org/drawingml/2006/main" noChangeAspect="1"/>
+          </wp:cNvGraphicFramePr>
+          <a:graphic xmlns:a="http://schemas.openxmlformats.org/drawingml/2006/main">
+            <a:graphicData uri="http://schemas.openxmlformats.org/drawingml/2006/picture">
+              <pic:pic xmlns:pic="http://schemas.openxmlformats.org/drawingml/2006/picture">
+                <pic:nvPicPr>
+                  <pic:cNvPr id="1292918069" name="Afbeelding 1292918069"/>
+                  <pic:cNvPicPr/>
+                </pic:nvPicPr>
+                <pic:blipFill rotWithShape="1">
+                  <a:blip r:embed="rId3">
+                    <a:extLst>
+                      <a:ext uri="{28A0092B-C50C-407E-A947-70E740481C1C}">
+                        <a14:useLocalDpi xmlns:a14="http://schemas.microsoft.com/office/drawing/2010/main" val="0"/>
+                      </a:ext>
+                    </a:extLst>
+                  </a:blip>
+                  <a:srcRect l="10430" t="36959" r="14907" b="34968"/>
+                  <a:stretch>
+                    <a:fillRect/>
+                  </a:stretch>
+                </pic:blipFill>
+                <pic:spPr bwMode="auto">
+                  <a:xfrm>
+                    <a:off x="0" y="0"/>
+                    <a:ext cx="1651895" cy="414068"/>
+                  </a:xfrm>
+                  <a:prstGeom prst="rect">
+                    <a:avLst/>
+                  </a:prstGeom>
+                  <a:ln>
+                    <a:noFill/>
+                  </a:ln>
+                  <a:extLst>
+                    <a:ext uri="{53640926-AAD7-44D8-BBD7-CCE9431645EC}">
+                      <a14:shadowObscured xmlns:a14="http://schemas.microsoft.com/office/drawing/2010/main"/>
+                    </a:ext>
+                  </a:extLst>
+                </pic:spPr>
+              </pic:pic>
+            </a:graphicData>
+          </a:graphic>
+          <wp14:sizeRelH relativeFrom="margin">
+            <wp14:pctWidth>0</wp14:pctWidth>
+          </wp14:sizeRelH>
+          <wp14:sizeRelV relativeFrom="margin">
+            <wp14:pctHeight>0</wp14:pctHeight>
+          </wp14:sizeRelV>
+        </wp:anchor>
+      </w:drawing>
+    </w:r>
   </w:p>
   <w:p>
     <w:pPr>
       <w:pStyle w:val="Voettekst"/>
-      <w:jc w:val="center"/>
       <w:rPr>
         <w:b/>
         <w:bCs/>
@@ -170,7 +263,7 @@
         <w:sz w:val="18"/>
         <w:szCs w:val="18"/>
       </w:rPr>
-      <w:t>Gekeurd volgens BMWT Keur</w:t>
+      <w:t xml:space="preserve">                                      Wij keuren volgens de normen van veiligwerken.frl</w:t>
     </w:r>
   </w:p>
 </w:ftr>

</xml_diff>